<commit_message>
Heading Change Capi And Print
</commit_message>
<xml_diff>
--- a/Resources/Template/TemplateHis2026.docx
+++ b/Resources/Template/TemplateHis2026.docx
@@ -158,7 +158,15 @@
           </w:tcPr>
           <w:p>
             <w:r>
-              <w:t>State/u.t name:</w:t>
+              <w:t>State</w:t>
+            </w:r>
+            <w:proofErr w:type="gramStart"/>
+            <w:r>
+              <w:t>/u</w:t>
+            </w:r>
+            <w:proofErr w:type="gramEnd"/>
+            <w:r>
+              <w:t>.t name:</w:t>
             </w:r>
           </w:p>
         </w:tc>
@@ -590,18 +598,18 @@
         <w:tblLook w:val="04A0" w:firstRow="1" w:lastRow="0" w:firstColumn="1" w:lastColumn="0" w:noHBand="0" w:noVBand="1"/>
       </w:tblPr>
       <w:tblGrid>
-        <w:gridCol w:w="326"/>
-        <w:gridCol w:w="933"/>
-        <w:gridCol w:w="893"/>
-        <w:gridCol w:w="437"/>
-        <w:gridCol w:w="625"/>
-        <w:gridCol w:w="1115"/>
-        <w:gridCol w:w="2160"/>
-        <w:gridCol w:w="462"/>
-        <w:gridCol w:w="578"/>
-        <w:gridCol w:w="462"/>
-        <w:gridCol w:w="578"/>
-        <w:gridCol w:w="1300"/>
+        <w:gridCol w:w="348"/>
+        <w:gridCol w:w="994"/>
+        <w:gridCol w:w="951"/>
+        <w:gridCol w:w="464"/>
+        <w:gridCol w:w="665"/>
+        <w:gridCol w:w="1188"/>
+        <w:gridCol w:w="2302"/>
+        <w:gridCol w:w="492"/>
+        <w:gridCol w:w="615"/>
+        <w:gridCol w:w="492"/>
+        <w:gridCol w:w="615"/>
+        <w:gridCol w:w="743"/>
       </w:tblGrid>
       <w:tr>
         <w:trPr>
@@ -980,29 +988,15 @@
               </w:rPr>
             </w:pPr>
             <w:r>
-              <w:t>whether a beneficiary of any Central/ State Government social assistance scheme as on date of survey </w:t>
-            </w:r>
-            <w:r>
-              <w:rPr>
-                <w:i/>
-                <w:iCs/>
-              </w:rPr>
-              <w:t>(yes-1/ no-2)</w:t>
-            </w:r>
-            <w:r>
-              <w:rPr>
-                <w:lang w:val="en-IN"/>
-              </w:rPr>
-              <w:t> </w:t>
-            </w:r>
-            <w:r>
-              <w:rPr>
-                <w:lang w:val="en-IN"/>
-              </w:rPr>
-              <w:br/>
-            </w:r>
-            <w:r>
-              <w:t>(Cash Transfer only)</w:t>
+              <w:t>Whether a beneficiary of any Central/State Government social assistance scheme* as on date of survey (yes-1/no-2</w:t>
+            </w:r>
+            <w:proofErr w:type="gramStart"/>
+            <w:r>
+              <w:t>)  *</w:t>
+            </w:r>
+            <w:proofErr w:type="gramEnd"/>
+            <w:r>
+              <w:t>Cash transfer only</w:t>
             </w:r>
           </w:p>
         </w:tc>
@@ -1177,8 +1171,13 @@
                 <w:lang w:val="en-IN"/>
               </w:rPr>
             </w:pPr>
-            <w:r>
-              <w:t>during 30 days</w:t>
+            <w:proofErr w:type="gramStart"/>
+            <w:r>
+              <w:t>during</w:t>
+            </w:r>
+            <w:proofErr w:type="gramEnd"/>
+            <w:r>
+              <w:t> 30 days</w:t>
             </w:r>
             <w:r>
               <w:rPr>
@@ -1206,8 +1205,13 @@
                 <w:lang w:val="en-IN"/>
               </w:rPr>
             </w:pPr>
-            <w:r>
-              <w:t>during 365 days</w:t>
+            <w:proofErr w:type="gramStart"/>
+            <w:r>
+              <w:t>during</w:t>
+            </w:r>
+            <w:proofErr w:type="gramEnd"/>
+            <w:r>
+              <w:t> 365 days</w:t>
             </w:r>
             <w:r>
               <w:rPr>
@@ -2143,8 +2147,13 @@
           </w:tcPr>
           <w:p>
             <w:r>
-              <w:t>[3]Remarks</w:t>
-            </w:r>
+              <w:t>[</w:t>
+            </w:r>
+            <w:proofErr w:type="gramStart"/>
+            <w:r>
+              <w:t>3]Remarks</w:t>
+            </w:r>
+            <w:proofErr w:type="gramEnd"/>
           </w:p>
         </w:tc>
         <w:tc>
@@ -2187,6 +2196,7 @@
               <w:rPr>
                 <w:b/>
               </w:rPr>
+              <w:lastRenderedPageBreak/>
               <w:t>[4]</w:t>
             </w:r>
             <w:r>
@@ -2419,7 +2429,6 @@
           </w:tcPr>
           <w:p>
             <w:r>
-              <w:lastRenderedPageBreak/>
               <w:t>Q4.4</w:t>
             </w:r>
           </w:p>
@@ -2437,7 +2446,11 @@
           </w:tcPr>
           <w:p>
             <w:r>
-              <w:t>Agricultural activity(</w:t>
+              <w:t xml:space="preserve">Agricultural </w:t>
+            </w:r>
+            <w:proofErr w:type="gramStart"/>
+            <w:r>
+              <w:t>activity(</w:t>
             </w:r>
             <w:proofErr w:type="spellStart"/>
             <w:r>
@@ -2445,7 +2458,19 @@
             </w:r>
             <w:proofErr w:type="spellEnd"/>
             <w:r>
-              <w:t>) carried out by one or more household member in last 365 days</w:t>
+              <w:t>)</w:t>
+            </w:r>
+            <w:proofErr w:type="gramEnd"/>
+            <w:r>
+              <w:t xml:space="preserve"> carried out by one or more household </w:t>
+            </w:r>
+            <w:proofErr w:type="gramStart"/>
+            <w:r>
+              <w:t>member</w:t>
+            </w:r>
+            <w:proofErr w:type="gramEnd"/>
+            <w:r>
+              <w:t xml:space="preserve"> in last 365 days</w:t>
             </w:r>
           </w:p>
         </w:tc>
@@ -3141,7 +3166,15 @@
           </w:tcPr>
           <w:p>
             <w:r>
-              <w:t>Use of land owned(multiple select)</w:t>
+              <w:t xml:space="preserve">Use of land </w:t>
+            </w:r>
+            <w:proofErr w:type="gramStart"/>
+            <w:r>
+              <w:t>owned(</w:t>
+            </w:r>
+            <w:proofErr w:type="gramEnd"/>
+            <w:r>
+              <w:t>multiple select)</w:t>
             </w:r>
           </w:p>
         </w:tc>
@@ -3477,7 +3510,31 @@
           </w:tcPr>
           <w:p>
             <w:r>
-              <w:t>Whether the household has any outstanding loan taken from financial institution* for the purpose of construction of land/house/building/flat or to meet expenditure of economic activity or; one or more of these?</w:t>
+              <w:t xml:space="preserve">Whether the household has any outstanding loan taken from financial institution* for the purpose of </w:t>
+            </w:r>
+            <w:proofErr w:type="gramStart"/>
+            <w:r>
+              <w:t>purchase</w:t>
+            </w:r>
+            <w:proofErr w:type="gramEnd"/>
+            <w:r>
+              <w:t xml:space="preserve"> </w:t>
+            </w:r>
+            <w:proofErr w:type="gramStart"/>
+            <w:r>
+              <w:t>/ construction of land</w:t>
+            </w:r>
+            <w:proofErr w:type="gramEnd"/>
+            <w:r>
+              <w:t xml:space="preserve">/house/building/flat or to meet expenditure of economic activity </w:t>
+            </w:r>
+            <w:proofErr w:type="gramStart"/>
+            <w:r>
+              <w:t>or;</w:t>
+            </w:r>
+            <w:proofErr w:type="gramEnd"/>
+            <w:r>
+              <w:t xml:space="preserve"> one or more of these?</w:t>
             </w:r>
           </w:p>
         </w:tc>
@@ -3834,172 +3891,213 @@
                 <w:szCs w:val="16"/>
               </w:rPr>
             </w:pPr>
+            <w:proofErr w:type="gramStart"/>
             <w:r>
               <w:rPr>
                 <w:sz w:val="16"/>
                 <w:szCs w:val="16"/>
               </w:rPr>
-              <w:t>Other including tips, fees of consultants etc.</w:t>
-            </w:r>
-          </w:p>
-        </w:tc>
-        <w:tc>
-          <w:tcPr>
-            <w:tcW w:w="1078" w:type="dxa"/>
-          </w:tcPr>
-          <w:p>
-            <w:pPr>
+              <w:t>Other including</w:t>
+            </w:r>
+            <w:proofErr w:type="gramEnd"/>
+            <w:r>
               <w:rPr>
                 <w:sz w:val="16"/>
                 <w:szCs w:val="16"/>
               </w:rPr>
-            </w:pPr>
-            <w:r>
+              <w:t xml:space="preserve"> tips, fees of consultants etc.</w:t>
+            </w:r>
+          </w:p>
+        </w:tc>
+        <w:tc>
+          <w:tcPr>
+            <w:tcW w:w="1078" w:type="dxa"/>
+          </w:tcPr>
+          <w:p>
+            <w:pPr>
               <w:rPr>
                 <w:sz w:val="16"/>
                 <w:szCs w:val="16"/>
               </w:rPr>
-              <w:t>Bonuses received (festival bonus, profit-sharing or production bonuses or other forms of profit-related payment, performance-based incentive)</w:t>
-            </w:r>
-          </w:p>
-        </w:tc>
-        <w:tc>
-          <w:tcPr>
-            <w:tcW w:w="990" w:type="dxa"/>
-          </w:tcPr>
-          <w:p>
-            <w:pPr>
+            </w:pPr>
+            <w:r>
               <w:rPr>
                 <w:sz w:val="16"/>
                 <w:szCs w:val="16"/>
               </w:rPr>
-            </w:pPr>
-            <w:r>
+              <w:t>Bonuses received (festival bonus, profit-sharing or production bonuses or other forms of profit-related payment, performance-based incentive)</w:t>
+            </w:r>
+          </w:p>
+        </w:tc>
+        <w:tc>
+          <w:tcPr>
+            <w:tcW w:w="990" w:type="dxa"/>
+          </w:tcPr>
+          <w:p>
+            <w:pPr>
               <w:rPr>
                 <w:sz w:val="16"/>
                 <w:szCs w:val="16"/>
               </w:rPr>
-              <w:t>Other including commission from sales, etc.</w:t>
-            </w:r>
-          </w:p>
-        </w:tc>
-        <w:tc>
-          <w:tcPr>
-            <w:tcW w:w="1069" w:type="dxa"/>
-          </w:tcPr>
-          <w:p>
-            <w:pPr>
+            </w:pPr>
+            <w:r>
               <w:rPr>
                 <w:sz w:val="16"/>
                 <w:szCs w:val="16"/>
               </w:rPr>
-            </w:pPr>
-            <w:r>
+              <w:t>Other including commission from sales, etc.</w:t>
+            </w:r>
+          </w:p>
+        </w:tc>
+        <w:tc>
+          <w:tcPr>
+            <w:tcW w:w="1069" w:type="dxa"/>
+          </w:tcPr>
+          <w:p>
+            <w:pPr>
               <w:rPr>
                 <w:sz w:val="16"/>
                 <w:szCs w:val="16"/>
               </w:rPr>
-              <w:t>Sale value of shares offered as part of employee remuneration (employee stock option)</w:t>
-            </w:r>
-          </w:p>
-        </w:tc>
-        <w:tc>
-          <w:tcPr>
-            <w:tcW w:w="1078" w:type="dxa"/>
-          </w:tcPr>
-          <w:p>
-            <w:pPr>
+            </w:pPr>
+            <w:r>
               <w:rPr>
                 <w:sz w:val="16"/>
                 <w:szCs w:val="16"/>
               </w:rPr>
-            </w:pPr>
-            <w:r>
+              <w:t>Sale value of shares offered as part of employee remuneration (employee stock option)</w:t>
+            </w:r>
+          </w:p>
+        </w:tc>
+        <w:tc>
+          <w:tcPr>
+            <w:tcW w:w="1078" w:type="dxa"/>
+          </w:tcPr>
+          <w:p>
+            <w:pPr>
               <w:rPr>
                 <w:sz w:val="16"/>
                 <w:szCs w:val="16"/>
               </w:rPr>
-              <w:t>Leave encashments; remuneration for time not worked such as for annual leave, holidays or other paid leave, Leave Fare Concession etc.</w:t>
-            </w:r>
-          </w:p>
-        </w:tc>
-        <w:tc>
-          <w:tcPr>
-            <w:tcW w:w="1069" w:type="dxa"/>
-          </w:tcPr>
-          <w:p>
-            <w:pPr>
+            </w:pPr>
+            <w:r>
               <w:rPr>
                 <w:sz w:val="16"/>
                 <w:szCs w:val="16"/>
               </w:rPr>
-            </w:pPr>
+              <w:t xml:space="preserve">Leave encashments; remuneration for time </w:t>
+            </w:r>
+            <w:proofErr w:type="gramStart"/>
             <w:r>
               <w:rPr>
                 <w:sz w:val="16"/>
                 <w:szCs w:val="16"/>
               </w:rPr>
-              <w:t>Severance and termination pay, termination benefits including social security benefits like maturity benefits of CGEGIS etc.</w:t>
-            </w:r>
-          </w:p>
-        </w:tc>
-        <w:tc>
-          <w:tcPr>
-            <w:tcW w:w="992" w:type="dxa"/>
-          </w:tcPr>
-          <w:p>
-            <w:pPr>
+              <w:t>not worked</w:t>
+            </w:r>
+            <w:proofErr w:type="gramEnd"/>
+            <w:r>
               <w:rPr>
                 <w:sz w:val="16"/>
                 <w:szCs w:val="16"/>
               </w:rPr>
-            </w:pPr>
-            <w:r>
+              <w:t xml:space="preserve"> such as for annual leave, holidays or other paid leave, Leave Fare Concession etc.</w:t>
+            </w:r>
+          </w:p>
+        </w:tc>
+        <w:tc>
+          <w:tcPr>
+            <w:tcW w:w="1069" w:type="dxa"/>
+          </w:tcPr>
+          <w:p>
+            <w:pPr>
               <w:rPr>
                 <w:sz w:val="16"/>
                 <w:szCs w:val="16"/>
               </w:rPr>
-              <w:t>Others – directors’ fees (fees given to the directors for attending meetings), sitting fees of experts etc.</w:t>
-            </w:r>
-          </w:p>
-        </w:tc>
-        <w:tc>
-          <w:tcPr>
-            <w:tcW w:w="833" w:type="dxa"/>
-          </w:tcPr>
-          <w:p>
-            <w:pPr>
+            </w:pPr>
+            <w:r>
               <w:rPr>
                 <w:sz w:val="16"/>
                 <w:szCs w:val="16"/>
               </w:rPr>
-            </w:pPr>
-            <w:r>
+              <w:t>Severance and termination pay, termination benefits including social security benefits like maturity benefits of CGEGIS etc.</w:t>
+            </w:r>
+          </w:p>
+        </w:tc>
+        <w:tc>
+          <w:tcPr>
+            <w:tcW w:w="992" w:type="dxa"/>
+          </w:tcPr>
+          <w:p>
+            <w:pPr>
               <w:rPr>
                 <w:sz w:val="16"/>
                 <w:szCs w:val="16"/>
               </w:rPr>
-              <w:t>Total monthly income</w:t>
-            </w:r>
-          </w:p>
-        </w:tc>
-        <w:tc>
-          <w:tcPr>
-            <w:tcW w:w="1182" w:type="dxa"/>
-          </w:tcPr>
-          <w:p>
-            <w:pPr>
+            </w:pPr>
+            <w:r>
               <w:rPr>
                 <w:sz w:val="16"/>
                 <w:szCs w:val="16"/>
               </w:rPr>
-            </w:pPr>
-            <w:r>
+              <w:t>Others – directors’ fees (fees given to the directors for attending meetings), sitting fees of experts etc.</w:t>
+            </w:r>
+          </w:p>
+        </w:tc>
+        <w:tc>
+          <w:tcPr>
+            <w:tcW w:w="833" w:type="dxa"/>
+          </w:tcPr>
+          <w:p>
+            <w:pPr>
               <w:rPr>
                 <w:sz w:val="16"/>
                 <w:szCs w:val="16"/>
               </w:rPr>
-              <w:t>Please check the entries and provide suitable  clarifications in following codes</w:t>
+            </w:pPr>
+            <w:r>
+              <w:rPr>
+                <w:sz w:val="16"/>
+                <w:szCs w:val="16"/>
+              </w:rPr>
+              <w:t>Total monthly income</w:t>
+            </w:r>
+          </w:p>
+        </w:tc>
+        <w:tc>
+          <w:tcPr>
+            <w:tcW w:w="1182" w:type="dxa"/>
+          </w:tcPr>
+          <w:p>
+            <w:pPr>
+              <w:rPr>
+                <w:sz w:val="16"/>
+                <w:szCs w:val="16"/>
+              </w:rPr>
+            </w:pPr>
+            <w:r>
+              <w:rPr>
+                <w:sz w:val="16"/>
+                <w:szCs w:val="16"/>
+              </w:rPr>
+              <w:t xml:space="preserve">Please check the entries and provide </w:t>
+            </w:r>
+            <w:proofErr w:type="gramStart"/>
+            <w:r>
+              <w:rPr>
+                <w:sz w:val="16"/>
+                <w:szCs w:val="16"/>
+              </w:rPr>
+              <w:t>suitable  clarifications</w:t>
+            </w:r>
+            <w:proofErr w:type="gramEnd"/>
+            <w:r>
+              <w:rPr>
+                <w:sz w:val="16"/>
+                <w:szCs w:val="16"/>
+              </w:rPr>
+              <w:t xml:space="preserve"> in following codes</w:t>
             </w:r>
           </w:p>
         </w:tc>
@@ -4652,8 +4750,13 @@
           </w:tcPr>
           <w:p>
             <w:r>
-              <w:t>[5]Remarks</w:t>
-            </w:r>
+              <w:t>[</w:t>
+            </w:r>
+            <w:proofErr w:type="gramStart"/>
+            <w:r>
+              <w:t>5]Remarks</w:t>
+            </w:r>
+            <w:proofErr w:type="gramEnd"/>
           </w:p>
         </w:tc>
         <w:tc>
@@ -4922,7 +5025,15 @@
               <w:spacing w:after="160" w:line="278" w:lineRule="auto"/>
             </w:pPr>
             <w:r>
-              <w:t>Please check the entries and provide suitable  clarifications in following codes</w:t>
+              <w:t xml:space="preserve">Please check the entries and provide </w:t>
+            </w:r>
+            <w:proofErr w:type="gramStart"/>
+            <w:r>
+              <w:t>suitable  clarifications</w:t>
+            </w:r>
+            <w:proofErr w:type="gramEnd"/>
+            <w:r>
+              <w:t xml:space="preserve"> in following codes</w:t>
             </w:r>
           </w:p>
         </w:tc>
@@ -5129,8 +5240,13 @@
               <w:spacing w:after="160" w:line="278" w:lineRule="auto"/>
             </w:pPr>
             <w:r>
-              <w:t>[6]Remarks</w:t>
-            </w:r>
+              <w:t>[</w:t>
+            </w:r>
+            <w:proofErr w:type="gramStart"/>
+            <w:r>
+              <w:t>6]Remarks</w:t>
+            </w:r>
+            <w:proofErr w:type="gramEnd"/>
           </w:p>
         </w:tc>
         <w:tc>
@@ -5432,75 +5548,36 @@
                 <w:b/>
                 <w:bCs/>
               </w:rPr>
-              <w:t>unit (Kg./no.</w:t>
-            </w:r>
+              <w:t>unit (</w:t>
+            </w:r>
+            <w:proofErr w:type="gramStart"/>
             <w:r>
               <w:rPr>
                 <w:b/>
                 <w:bCs/>
               </w:rPr>
-              <w:t>)</w:t>
-            </w:r>
-          </w:p>
-        </w:tc>
-        <w:tc>
-          <w:tcPr>
-            <w:tcW w:w="1232" w:type="dxa"/>
-            <w:tcBorders>
-              <w:top w:val="single" w:sz="6" w:space="0" w:color="auto"/>
-              <w:left w:val="single" w:sz="6" w:space="0" w:color="auto"/>
-              <w:bottom w:val="single" w:sz="6" w:space="0" w:color="auto"/>
-              <w:right w:val="single" w:sz="6" w:space="0" w:color="auto"/>
-            </w:tcBorders>
-            <w:vAlign w:val="center"/>
-            <w:hideMark/>
-          </w:tcPr>
-          <w:p>
-            <w:pPr>
-              <w:rPr>
-                <w:lang w:val="en-IN"/>
-              </w:rPr>
-            </w:pPr>
+              <w:t>Kg./</w:t>
+            </w:r>
+            <w:proofErr w:type="gramEnd"/>
             <w:r>
               <w:rPr>
                 <w:b/>
                 <w:bCs/>
               </w:rPr>
-              <w:t>Total Quantity Produced (harvested)</w:t>
-            </w:r>
-          </w:p>
-        </w:tc>
-        <w:tc>
-          <w:tcPr>
-            <w:tcW w:w="1027" w:type="dxa"/>
-            <w:tcBorders>
-              <w:top w:val="single" w:sz="6" w:space="0" w:color="auto"/>
-              <w:left w:val="single" w:sz="6" w:space="0" w:color="auto"/>
-              <w:bottom w:val="single" w:sz="6" w:space="0" w:color="auto"/>
-              <w:right w:val="single" w:sz="6" w:space="0" w:color="auto"/>
-            </w:tcBorders>
-            <w:vAlign w:val="center"/>
-            <w:hideMark/>
-          </w:tcPr>
-          <w:p>
-            <w:pPr>
-              <w:rPr>
-                <w:lang w:val="en-IN"/>
-              </w:rPr>
-            </w:pPr>
+              <w:t>no.</w:t>
+            </w:r>
             <w:r>
               <w:rPr>
                 <w:b/>
                 <w:bCs/>
-                <w:lang w:val="en-IN"/>
-              </w:rPr>
-              <w:t>total quantity sold (out of total production)</w:t>
-            </w:r>
-          </w:p>
-        </w:tc>
-        <w:tc>
-          <w:tcPr>
-            <w:tcW w:w="975" w:type="dxa"/>
+              </w:rPr>
+              <w:t>)</w:t>
+            </w:r>
+          </w:p>
+        </w:tc>
+        <w:tc>
+          <w:tcPr>
+            <w:tcW w:w="1232" w:type="dxa"/>
             <w:tcBorders>
               <w:top w:val="single" w:sz="6" w:space="0" w:color="auto"/>
               <w:left w:val="single" w:sz="6" w:space="0" w:color="auto"/>
@@ -5521,13 +5598,13 @@
                 <w:b/>
                 <w:bCs/>
               </w:rPr>
-              <w:t>Total sale value(in Rs.)</w:t>
-            </w:r>
-          </w:p>
-        </w:tc>
-        <w:tc>
-          <w:tcPr>
-            <w:tcW w:w="993" w:type="dxa"/>
+              <w:t>Total Quantity Produced (harvested)</w:t>
+            </w:r>
+          </w:p>
+        </w:tc>
+        <w:tc>
+          <w:tcPr>
+            <w:tcW w:w="1027" w:type="dxa"/>
             <w:tcBorders>
               <w:top w:val="single" w:sz="6" w:space="0" w:color="auto"/>
               <w:left w:val="single" w:sz="6" w:space="0" w:color="auto"/>
@@ -5547,14 +5624,15 @@
               <w:rPr>
                 <w:b/>
                 <w:bCs/>
-              </w:rPr>
-              <w:t>Average per unit sale value (in Rs.)</w:t>
-            </w:r>
-          </w:p>
-        </w:tc>
-        <w:tc>
-          <w:tcPr>
-            <w:tcW w:w="928" w:type="dxa"/>
+                <w:lang w:val="en-IN"/>
+              </w:rPr>
+              <w:t>total quantity sold (out of total production)</w:t>
+            </w:r>
+          </w:p>
+        </w:tc>
+        <w:tc>
+          <w:tcPr>
+            <w:tcW w:w="975" w:type="dxa"/>
             <w:tcBorders>
               <w:top w:val="single" w:sz="6" w:space="0" w:color="auto"/>
               <w:left w:val="single" w:sz="6" w:space="0" w:color="auto"/>
@@ -5575,7 +5653,93 @@
                 <w:b/>
                 <w:bCs/>
               </w:rPr>
-              <w:t>Value of pre-harvested sale (Rs.)</w:t>
+              <w:t xml:space="preserve">Total sale </w:t>
+            </w:r>
+            <w:proofErr w:type="gramStart"/>
+            <w:r>
+              <w:rPr>
+                <w:b/>
+                <w:bCs/>
+              </w:rPr>
+              <w:t>value(</w:t>
+            </w:r>
+            <w:proofErr w:type="gramEnd"/>
+            <w:r>
+              <w:rPr>
+                <w:b/>
+                <w:bCs/>
+              </w:rPr>
+              <w:t>in Rs.)</w:t>
+            </w:r>
+          </w:p>
+        </w:tc>
+        <w:tc>
+          <w:tcPr>
+            <w:tcW w:w="993" w:type="dxa"/>
+            <w:tcBorders>
+              <w:top w:val="single" w:sz="6" w:space="0" w:color="auto"/>
+              <w:left w:val="single" w:sz="6" w:space="0" w:color="auto"/>
+              <w:bottom w:val="single" w:sz="6" w:space="0" w:color="auto"/>
+              <w:right w:val="single" w:sz="6" w:space="0" w:color="auto"/>
+            </w:tcBorders>
+            <w:vAlign w:val="center"/>
+            <w:hideMark/>
+          </w:tcPr>
+          <w:p>
+            <w:pPr>
+              <w:rPr>
+                <w:lang w:val="en-IN"/>
+              </w:rPr>
+            </w:pPr>
+            <w:r>
+              <w:rPr>
+                <w:b/>
+                <w:bCs/>
+              </w:rPr>
+              <w:t>Average per unit sale value (in Rs.)</w:t>
+            </w:r>
+          </w:p>
+        </w:tc>
+        <w:tc>
+          <w:tcPr>
+            <w:tcW w:w="928" w:type="dxa"/>
+            <w:tcBorders>
+              <w:top w:val="single" w:sz="6" w:space="0" w:color="auto"/>
+              <w:left w:val="single" w:sz="6" w:space="0" w:color="auto"/>
+              <w:bottom w:val="single" w:sz="6" w:space="0" w:color="auto"/>
+              <w:right w:val="single" w:sz="6" w:space="0" w:color="auto"/>
+            </w:tcBorders>
+            <w:vAlign w:val="center"/>
+            <w:hideMark/>
+          </w:tcPr>
+          <w:p>
+            <w:pPr>
+              <w:rPr>
+                <w:lang w:val="en-IN"/>
+              </w:rPr>
+            </w:pPr>
+            <w:r>
+              <w:rPr>
+                <w:b/>
+                <w:bCs/>
+              </w:rPr>
+              <w:t xml:space="preserve">Value of pre-harvested </w:t>
+            </w:r>
+            <w:proofErr w:type="gramStart"/>
+            <w:r>
+              <w:rPr>
+                <w:b/>
+                <w:bCs/>
+              </w:rPr>
+              <w:t>sale</w:t>
+            </w:r>
+            <w:proofErr w:type="gramEnd"/>
+            <w:r>
+              <w:rPr>
+                <w:b/>
+                <w:bCs/>
+              </w:rPr>
+              <w:t xml:space="preserve"> (Rs.)</w:t>
             </w:r>
           </w:p>
         </w:tc>
@@ -6316,8 +6480,13 @@
               <w:spacing w:after="160" w:line="278" w:lineRule="auto"/>
             </w:pPr>
             <w:r>
-              <w:t>[7a_1]Remarks</w:t>
-            </w:r>
+              <w:t>[7a_</w:t>
+            </w:r>
+            <w:proofErr w:type="gramStart"/>
+            <w:r>
+              <w:t>1]Remarks</w:t>
+            </w:r>
+            <w:proofErr w:type="gramEnd"/>
           </w:p>
         </w:tc>
         <w:tc>
@@ -8006,7 +8175,15 @@
               </w:rPr>
             </w:pPr>
             <w:r>
-              <w:t>Sale value of produces which were cultivated beyond last 365 days but sold during last 365 days (in whole no. of Rs.)</w:t>
+              <w:t xml:space="preserve">Sale value of </w:t>
+            </w:r>
+            <w:proofErr w:type="gramStart"/>
+            <w:r>
+              <w:t>produces</w:t>
+            </w:r>
+            <w:proofErr w:type="gramEnd"/>
+            <w:r>
+              <w:t xml:space="preserve"> which were cultivated beyond last 365 days but sold during last 365 days (in whole no. of Rs.)</w:t>
             </w:r>
             <w:r>
               <w:rPr>
@@ -8332,8 +8509,13 @@
             <w:pPr>
               <w:spacing w:after="160" w:line="278" w:lineRule="auto"/>
             </w:pPr>
-            <w:r>
-              <w:t>Remarks(if “</w:t>
+            <w:proofErr w:type="gramStart"/>
+            <w:r>
+              <w:t>Remarks(</w:t>
+            </w:r>
+            <w:proofErr w:type="gramEnd"/>
+            <w:r>
+              <w:t>if “</w:t>
             </w:r>
             <w:r>
               <w:rPr>
@@ -8350,7 +8532,15 @@
               <w:t>”</w:t>
             </w:r>
             <w:r>
-              <w:t xml:space="preserve"> selected in  Q7a.9.1)</w:t>
+              <w:t xml:space="preserve"> selected </w:t>
+            </w:r>
+            <w:proofErr w:type="gramStart"/>
+            <w:r>
+              <w:t>in  Q7a.9.1</w:t>
+            </w:r>
+            <w:proofErr w:type="gramEnd"/>
+            <w:r>
+              <w:t>)</w:t>
             </w:r>
           </w:p>
         </w:tc>
@@ -9529,7 +9719,13 @@
               </w:rPr>
             </w:pPr>
             <w:r>
-              <w:t>timber, bamboo, wood etc.</w:t>
+              <w:t>timber,</w:t>
+            </w:r>
+            <w:r>
+              <w:t xml:space="preserve"> </w:t>
+            </w:r>
+            <w:r>
+              <w:t>wood etc.</w:t>
             </w:r>
             <w:r>
               <w:rPr>
@@ -11385,13 +11581,7 @@
               </w:rPr>
             </w:pPr>
             <w:r>
-              <w:t>Imputed value of any of the items (as mentioned in Q7.6) consumed by the household or bartered to other households out of total production during last 365 days (in whole no. of Rs.)</w:t>
-            </w:r>
-            <w:r>
-              <w:rPr>
-                <w:lang w:val="en-IN"/>
-              </w:rPr>
-              <w:t> </w:t>
+              <w:t>Imputed value of any of the items (as mentioned in Q7.6) consumed by the household and/or bartered to other households out of total production during last 365 days (in whole no. of Rs.)</w:t>
             </w:r>
           </w:p>
         </w:tc>
@@ -11643,8 +11833,13 @@
             <w:pPr>
               <w:spacing w:after="160" w:line="278" w:lineRule="auto"/>
             </w:pPr>
-            <w:r>
-              <w:t>Remarks(if “</w:t>
+            <w:proofErr w:type="gramStart"/>
+            <w:r>
+              <w:t>Remarks(</w:t>
+            </w:r>
+            <w:proofErr w:type="gramEnd"/>
+            <w:r>
+              <w:t>if “</w:t>
             </w:r>
             <w:r>
               <w:rPr>
@@ -11661,7 +11856,15 @@
               <w:t>”</w:t>
             </w:r>
             <w:r>
-              <w:t xml:space="preserve"> selected in  Q7b.9.1)</w:t>
+              <w:t xml:space="preserve"> selected </w:t>
+            </w:r>
+            <w:proofErr w:type="gramStart"/>
+            <w:r>
+              <w:t>in  Q7b.9.1</w:t>
+            </w:r>
+            <w:proofErr w:type="gramEnd"/>
+            <w:r>
+              <w:t>)</w:t>
             </w:r>
           </w:p>
         </w:tc>
@@ -12016,7 +12219,15 @@
               </w:rPr>
             </w:pPr>
             <w:r>
-              <w:t>(in Rs.)</w:t>
+              <w:t>(</w:t>
+            </w:r>
+            <w:proofErr w:type="gramStart"/>
+            <w:r>
+              <w:t>in</w:t>
+            </w:r>
+            <w:proofErr w:type="gramEnd"/>
+            <w:r>
+              <w:t> Rs.)</w:t>
             </w:r>
             <w:r>
               <w:rPr>
@@ -12280,8 +12491,13 @@
           <w:p>
             <w:bookmarkStart w:id="0" w:name="_Hlk218793563"/>
             <w:r>
-              <w:t>[7_c]Remarks</w:t>
-            </w:r>
+              <w:t>[7_</w:t>
+            </w:r>
+            <w:proofErr w:type="gramStart"/>
+            <w:r>
+              <w:t>c]Remarks</w:t>
+            </w:r>
+            <w:proofErr w:type="gramEnd"/>
           </w:p>
         </w:tc>
         <w:tc>
@@ -13532,8 +13748,13 @@
             <w:pPr>
               <w:spacing w:after="160" w:line="278" w:lineRule="auto"/>
             </w:pPr>
-            <w:r>
-              <w:t>Remarks(if “</w:t>
+            <w:proofErr w:type="gramStart"/>
+            <w:r>
+              <w:t>Remarks(</w:t>
+            </w:r>
+            <w:proofErr w:type="gramEnd"/>
+            <w:r>
+              <w:t>if “</w:t>
             </w:r>
             <w:r>
               <w:rPr>
@@ -13550,7 +13771,15 @@
               <w:t>”</w:t>
             </w:r>
             <w:r>
-              <w:t xml:space="preserve"> selected in  Q7c.9.1)</w:t>
+              <w:t xml:space="preserve"> selected </w:t>
+            </w:r>
+            <w:proofErr w:type="gramStart"/>
+            <w:r>
+              <w:t>in  Q7c.9.1</w:t>
+            </w:r>
+            <w:proofErr w:type="gramEnd"/>
+            <w:r>
+              <w:t>)</w:t>
             </w:r>
           </w:p>
         </w:tc>
@@ -13837,8 +14066,13 @@
               </w:rPr>
             </w:pPr>
             <w:r>
-              <w:t>[7d]Remarks</w:t>
-            </w:r>
+              <w:t>[7</w:t>
+            </w:r>
+            <w:proofErr w:type="gramStart"/>
+            <w:r>
+              <w:t>d]Remarks</w:t>
+            </w:r>
+            <w:proofErr w:type="gramEnd"/>
           </w:p>
         </w:tc>
         <w:tc>
@@ -15111,8 +15345,13 @@
           </w:tcPr>
           <w:p>
             <w:r>
-              <w:t>[8.1]Remarks</w:t>
-            </w:r>
+              <w:t>[</w:t>
+            </w:r>
+            <w:proofErr w:type="gramStart"/>
+            <w:r>
+              <w:t>8.1]Remarks</w:t>
+            </w:r>
+            <w:proofErr w:type="gramEnd"/>
           </w:p>
         </w:tc>
         <w:tc>
@@ -17744,7 +17983,15 @@
               </w:rPr>
             </w:pPr>
             <w:r>
-              <w:t>cereals &amp; cereal products, pulses &amp; pulse products, salt &amp; sugar, edible oil, spices, dry fruits &amp; nuts</w:t>
+              <w:t xml:space="preserve">cereals &amp; cereal products, pulses &amp; pulse products, salt &amp; sugar, edible oil, spices, dry </w:t>
+            </w:r>
+            <w:proofErr w:type="gramStart"/>
+            <w:r>
+              <w:t>fruits</w:t>
+            </w:r>
+            <w:proofErr w:type="gramEnd"/>
+            <w:r>
+              <w:t xml:space="preserve"> &amp; nuts</w:t>
             </w:r>
             <w:r>
               <w:rPr>
@@ -20536,7 +20783,39 @@
               </w:rPr>
             </w:pPr>
             <w:r>
-              <w:t>Total expenditure = [{sum (Q10.1: 10.2) + Q10.4)} / 7 x 30] + {Q 10.3 + Q 10.5 + Q 10.91 + sum (Q 10.6: Q 10.10 + Q 10.12 + Q 10.92} + [{ sum (Q 10.13: Q 10.22) + Q 10.93} / 365 x 30]</w:t>
+              <w:t xml:space="preserve">Total expenditure </w:t>
+            </w:r>
+            <w:proofErr w:type="gramStart"/>
+            <w:r>
+              <w:t>= [{</w:t>
+            </w:r>
+            <w:proofErr w:type="gramEnd"/>
+            <w:r>
+              <w:t>sum (Q10.1: 10.2) + Q10.</w:t>
+            </w:r>
+            <w:proofErr w:type="gramStart"/>
+            <w:r>
+              <w:t>4)}</w:t>
+            </w:r>
+            <w:proofErr w:type="gramEnd"/>
+            <w:r>
+              <w:t xml:space="preserve"> / 7 x 30] + {Q 10.3 + Q 10.5 + Q 10.91 + sum (Q 10.6: Q 10.10 + Q 10.12 + Q 10.92} + </w:t>
+            </w:r>
+            <w:proofErr w:type="gramStart"/>
+            <w:r>
+              <w:t>[{ sum</w:t>
+            </w:r>
+            <w:proofErr w:type="gramEnd"/>
+            <w:r>
+              <w:t xml:space="preserve"> (Q 10.13: Q 10.22) + Q </w:t>
+            </w:r>
+            <w:proofErr w:type="gramStart"/>
+            <w:r>
+              <w:t>10.93} /</w:t>
+            </w:r>
+            <w:proofErr w:type="gramEnd"/>
+            <w:r>
+              <w:t xml:space="preserve"> 365 x 30]</w:t>
             </w:r>
           </w:p>
         </w:tc>
@@ -21164,30 +21443,7 @@
               </w:rPr>
             </w:pPr>
             <w:r>
-              <w:t>Whether transfers paid to other households in the form of family support payments (such as alimony, child and parental support) </w:t>
-            </w:r>
-            <w:r>
-              <w:rPr>
-                <w:b/>
-                <w:bCs/>
-              </w:rPr>
-              <w:t>during last 365 days</w:t>
-            </w:r>
-            <w:r>
-              <w:t>? </w:t>
-            </w:r>
-            <w:r>
-              <w:rPr>
-                <w:i/>
-                <w:iCs/>
-              </w:rPr>
-              <w:t>(yes - 1, no – 2)</w:t>
-            </w:r>
-            <w:r>
-              <w:rPr>
-                <w:lang w:val="en-IN"/>
-              </w:rPr>
-              <w:t> </w:t>
+              <w:t>Whether transfers paid to other households in the form of family support payments (such as alimony, child and parental support) during last 365 days excluding any payment which are monthly in nature and already recorded in Q11.1? (yes - 1, no – 2)</w:t>
             </w:r>
           </w:p>
         </w:tc>
@@ -21906,7 +22162,15 @@
               </w:rPr>
             </w:pPr>
             <w:r>
-              <w:t>(in Rs.)</w:t>
+              <w:t>(</w:t>
+            </w:r>
+            <w:proofErr w:type="gramStart"/>
+            <w:r>
+              <w:t>in</w:t>
+            </w:r>
+            <w:proofErr w:type="gramEnd"/>
+            <w:r>
+              <w:t> Rs.)</w:t>
             </w:r>
             <w:r>
               <w:rPr>
@@ -22137,8 +22401,13 @@
               <w:spacing w:after="160" w:line="278" w:lineRule="auto"/>
             </w:pPr>
             <w:r>
-              <w:t>[11b]Remarks</w:t>
-            </w:r>
+              <w:t>[11</w:t>
+            </w:r>
+            <w:proofErr w:type="gramStart"/>
+            <w:r>
+              <w:t>b]Remarks</w:t>
+            </w:r>
+            <w:proofErr w:type="gramEnd"/>
           </w:p>
         </w:tc>
         <w:tc>
@@ -22194,11 +22463,16 @@
             <w:r>
               <w:t>12</w:t>
             </w:r>
+            <w:proofErr w:type="gramStart"/>
             <w:r>
               <w:t xml:space="preserve">] </w:t>
             </w:r>
             <w:r>
-              <w:t xml:space="preserve"> Particulars of Total Income of the Household</w:t>
+              <w:t xml:space="preserve"> Particulars</w:t>
+            </w:r>
+            <w:proofErr w:type="gramEnd"/>
+            <w:r>
+              <w:t xml:space="preserve"> of Total Income of the Household</w:t>
             </w:r>
           </w:p>
         </w:tc>
@@ -23604,7 +23878,15 @@
               </w:rPr>
             </w:pPr>
             <w:r>
-              <w:t>Transfer paid to non-household member (Block 11a)</w:t>
+              <w:t xml:space="preserve">Transfer paid to non-household </w:t>
+            </w:r>
+            <w:proofErr w:type="gramStart"/>
+            <w:r>
+              <w:t>member</w:t>
+            </w:r>
+            <w:proofErr w:type="gramEnd"/>
+            <w:r>
+              <w:t> (Block 11a)</w:t>
             </w:r>
             <w:r>
               <w:rPr>
@@ -24646,15 +24928,24 @@
                 <w:sz w:val="18"/>
                 <w:szCs w:val="18"/>
               </w:rPr>
-              <w:t xml:space="preserve">Date of </w:t>
-            </w:r>
+              <w:t xml:space="preserve">Date </w:t>
+            </w:r>
+            <w:proofErr w:type="gramStart"/>
             <w:r>
               <w:rPr>
                 <w:sz w:val="18"/>
                 <w:szCs w:val="18"/>
               </w:rPr>
+              <w:t xml:space="preserve">of </w:t>
+            </w:r>
+            <w:r>
+              <w:rPr>
+                <w:sz w:val="18"/>
+                <w:szCs w:val="18"/>
+              </w:rPr>
               <w:t xml:space="preserve"> Scrutiny</w:t>
             </w:r>
+            <w:proofErr w:type="gramEnd"/>
           </w:p>
         </w:tc>
         <w:tc>
@@ -25274,7 +25565,23 @@
                 <w:sz w:val="18"/>
                 <w:szCs w:val="18"/>
               </w:rPr>
-              <w:t>Mobile number of informant/any other household member who can be contacted</w:t>
+              <w:t xml:space="preserve">Mobile number of informant/any other household </w:t>
+            </w:r>
+            <w:proofErr w:type="gramStart"/>
+            <w:r>
+              <w:rPr>
+                <w:sz w:val="18"/>
+                <w:szCs w:val="18"/>
+              </w:rPr>
+              <w:t>member</w:t>
+            </w:r>
+            <w:proofErr w:type="gramEnd"/>
+            <w:r>
+              <w:rPr>
+                <w:sz w:val="18"/>
+                <w:szCs w:val="18"/>
+              </w:rPr>
+              <w:t xml:space="preserve"> who can be contacted</w:t>
             </w:r>
           </w:p>
         </w:tc>

</xml_diff>